<commit_message>
CV şablonuna kullanıcının cv_560 üzerindeki ayarını uygula
Değerler cv_560 Google Doc'unun ilk ve son revizyonunun DOCX dışa
aktarımlarının farkından çıkarıldı:
- fotoğraf 53.5pt, sayfanın sol üst köşesine yakın (soldan 15.9, üstten 10.6pt)
- rol satırı 12pt, satır aralığı 1.0
- iletişim iki ortalı satır, 10pt; portfolyo tam URL; boşluk paragrafları yok
- bölüm başlıkları 9pt

Aynı Markdown'dan basılan PDF kullanıcının PDF'iyle konum ve görüntü
olarak birebir aynı. Tek sayfa payı biraz büyüdü (cv_base 758.0 -> 756.4pt).
Ayar öncesi ATS şablonu templates/cv_template_ats_v1.docx olarak duruyor,
CV_TEMPLATE ile seçilir. .env.example'daki yanlış "A4" notu düzeltildi.

Co-Authored-By: Claude Opus 5.5 <noreply@anthropic.com>
</commit_message>
<xml_diff>
--- a/templates/cv_template.docx
+++ b/templates/cv_template.docx
@@ -55,12 +55,12 @@
           <wp:anchor allowOverlap="1" behindDoc="0" distB="114300" distT="114300" distL="114300" distR="114300" hidden="0" layoutInCell="1" locked="0" relativeHeight="0" simplePos="0">
             <wp:simplePos x="0" y="0"/>
             <wp:positionH relativeFrom="page">
-              <wp:posOffset>515885</wp:posOffset>
+              <wp:posOffset>201559</wp:posOffset>
             </wp:positionH>
             <wp:positionV relativeFrom="page">
-              <wp:posOffset>118872</wp:posOffset>
+              <wp:posOffset>134884</wp:posOffset>
             </wp:positionV>
-            <wp:extent cx="576278" cy="576278"/>
+            <wp:extent cx="679503" cy="679503"/>
             <wp:effectExtent b="0" l="0" r="0" t="0"/>
             <wp:wrapNone/>
             <wp:docPr id="5" name="image4.png"/>
@@ -81,7 +81,7 @@
                   <pic:spPr>
                     <a:xfrm>
                       <a:off x="0" y="0"/>
-                      <a:ext cx="576278" cy="576278"/>
+                      <a:ext cx="679503" cy="679503"/>
                     </a:xfrm>
                     <a:prstGeom prst="rect"/>
                     <a:ln/>
@@ -122,40 +122,26 @@
     <w:p>
       <w:pPr>
         <w:widowControl w:val="0"/>
-        <w:spacing w:line="216" w:lineRule="auto"/>
+        <w:spacing w:line="240" w:lineRule="auto"/>
         <w:jc w:val="center"/>
         <w:rPr>
+          <w:rFonts w:ascii="Nunito" w:cs="Nunito" w:eastAsia="Nunito" w:hAnsi="Nunito"/>
+          <w:b w:val="1"/>
+          <w:bCs w:val="1"/>
+          <w:color w:val="76a5af"/>
+          <w:sz w:val="4"/>
+          <w:szCs w:val="4"/>
+        </w:rPr>
+      </w:pPr>
+      <w:r>
+        <w:rPr>
           <w:rFonts w:ascii="Spectral Medium" w:cs="Spectral Medium" w:eastAsia="Spectral Medium" w:hAnsi="Spectral Medium"/>
-        </w:rPr>
-      </w:pPr>
-      <w:r>
-        <w:rPr>
-          <w:rFonts w:ascii="Spectral Medium" w:cs="Spectral Medium" w:eastAsia="Spectral Medium" w:hAnsi="Spectral Medium"/>
+          <w:sz w:val="24"/>
+          <w:szCs w:val="24"/>
           <w:rtl w:val="0"/>
         </w:rPr>
         <w:t xml:space="preserve">Backend Developer | Node.js (NestJS) &amp; .NET</w:t>
       </w:r>
-      <w:r>
-        <w:rPr>
-          <w:rtl w:val="0"/>
-        </w:rPr>
-      </w:r>
-    </w:p>
-    <w:p>
-      <w:pPr>
-        <w:widowControl w:val="0"/>
-        <w:spacing w:line="167.99999999999997" w:lineRule="auto"/>
-        <w:ind w:left="-270" w:firstLine="0"/>
-        <w:jc w:val="left"/>
-        <w:rPr>
-          <w:rFonts w:ascii="Nunito" w:cs="Nunito" w:eastAsia="Nunito" w:hAnsi="Nunito"/>
-          <w:b w:val="1"/>
-          <w:bCs w:val="1"/>
-          <w:color w:val="76a5af"/>
-          <w:sz w:val="8"/>
-          <w:szCs w:val="8"/>
-        </w:rPr>
-      </w:pPr>
       <w:r>
         <w:rPr>
           <w:rtl w:val="0"/>
@@ -166,40 +152,30 @@
       <w:pPr>
         <w:widowControl w:val="0"/>
         <w:spacing w:line="240" w:lineRule="auto"/>
-        <w:jc w:val="right"/>
-        <w:rPr>
-          <w:rFonts w:ascii="Nunito" w:cs="Nunito" w:eastAsia="Nunito" w:hAnsi="Nunito"/>
-          <w:color w:val="0f0f0f"/>
-          <w:sz w:val="17"/>
-          <w:szCs w:val="17"/>
-        </w:rPr>
-      </w:pPr>
-      <w:r>
-        <w:rPr>
-          <w:rFonts w:ascii="Nunito" w:cs="Nunito" w:eastAsia="Nunito" w:hAnsi="Nunito"/>
-          <w:color w:val="0f0f0f"/>
-          <w:sz w:val="17"/>
-          <w:szCs w:val="17"/>
-          <w:rtl w:val="0"/>
-        </w:rPr>
-        <w:t xml:space="preserve">+90 507 385 38 10</w:t>
-      </w:r>
-      <w:r>
-        <w:rPr>
-          <w:rFonts w:ascii="Nunito" w:cs="Nunito" w:eastAsia="Nunito" w:hAnsi="Nunito"/>
-          <w:color w:val="0f0f0f"/>
-          <w:sz w:val="17"/>
-          <w:szCs w:val="17"/>
-          <w:rtl w:val="0"/>
-        </w:rPr>
-        <w:t xml:space="preserve"> | </w:t>
+        <w:jc w:val="center"/>
+        <w:rPr>
+          <w:rFonts w:ascii="Nunito" w:cs="Nunito" w:eastAsia="Nunito" w:hAnsi="Nunito"/>
+          <w:color w:val="0f0f0f"/>
+          <w:sz w:val="20"/>
+          <w:szCs w:val="20"/>
+        </w:rPr>
+      </w:pPr>
+      <w:r>
+        <w:rPr>
+          <w:rFonts w:ascii="Nunito" w:cs="Nunito" w:eastAsia="Nunito" w:hAnsi="Nunito"/>
+          <w:color w:val="0f0f0f"/>
+          <w:sz w:val="20"/>
+          <w:szCs w:val="20"/>
+          <w:rtl w:val="0"/>
+        </w:rPr>
+        <w:t xml:space="preserve">+90 507 385 38 10 | </w:t>
       </w:r>
       <w:hyperlink r:id="rId12">
         <w:r>
           <w:rPr>
             <w:rFonts w:ascii="Nunito" w:cs="Nunito" w:eastAsia="Nunito" w:hAnsi="Nunito"/>
-            <w:sz w:val="17"/>
-            <w:szCs w:val="17"/>
+            <w:sz w:val="20"/>
+            <w:szCs w:val="20"/>
             <w:rtl w:val="0"/>
           </w:rPr>
           <w:t xml:space="preserve">ersinisgor@hotmail.com</w:t>
@@ -209,19 +185,34 @@
         <w:rPr>
           <w:rFonts w:ascii="Nunito" w:cs="Nunito" w:eastAsia="Nunito" w:hAnsi="Nunito"/>
           <w:color w:val="0f0f0f"/>
-          <w:sz w:val="17"/>
-          <w:szCs w:val="17"/>
-          <w:rtl w:val="0"/>
-        </w:rPr>
-        <w:t xml:space="preserve"> | </w:t>
-      </w:r>
+          <w:sz w:val="20"/>
+          <w:szCs w:val="20"/>
+          <w:rtl w:val="0"/>
+        </w:rPr>
+        <w:t xml:space="preserve"> | Balıkesir, Turkey</w:t>
+      </w:r>
+    </w:p>
+    <w:p>
+      <w:pPr>
+        <w:widowControl w:val="0"/>
+        <w:spacing w:line="168" w:lineRule="auto"/>
+        <w:jc w:val="center"/>
+        <w:rPr>
+          <w:rFonts w:ascii="Nunito" w:cs="Nunito" w:eastAsia="Nunito" w:hAnsi="Nunito"/>
+          <w:b w:val="1"/>
+          <w:bCs w:val="1"/>
+          <w:color w:val="76a5af"/>
+          <w:sz w:val="2"/>
+          <w:szCs w:val="2"/>
+        </w:rPr>
+      </w:pPr>
       <w:hyperlink r:id="rId13">
         <w:r>
           <w:rPr>
             <w:rFonts w:ascii="Nunito" w:cs="Nunito" w:eastAsia="Nunito" w:hAnsi="Nunito"/>
             <w:color w:val="1155cc"/>
-            <w:sz w:val="17"/>
-            <w:szCs w:val="17"/>
+            <w:sz w:val="20"/>
+            <w:szCs w:val="20"/>
             <w:rtl w:val="0"/>
           </w:rPr>
           <w:t xml:space="preserve">linkedin.com/in/ersin-isgor</w:t>
@@ -231,8 +222,8 @@
         <w:rPr>
           <w:rFonts w:ascii="Nunito" w:cs="Nunito" w:eastAsia="Nunito" w:hAnsi="Nunito"/>
           <w:color w:val="0f0f0f"/>
-          <w:sz w:val="17"/>
-          <w:szCs w:val="17"/>
+          <w:sz w:val="20"/>
+          <w:szCs w:val="20"/>
           <w:rtl w:val="0"/>
         </w:rPr>
         <w:t xml:space="preserve"> | </w:t>
@@ -242,8 +233,8 @@
           <w:rPr>
             <w:rFonts w:ascii="Nunito" w:cs="Nunito" w:eastAsia="Nunito" w:hAnsi="Nunito"/>
             <w:color w:val="1155cc"/>
-            <w:sz w:val="17"/>
-            <w:szCs w:val="17"/>
+            <w:sz w:val="20"/>
+            <w:szCs w:val="20"/>
             <w:rtl w:val="0"/>
           </w:rPr>
           <w:t xml:space="preserve">github.com/ersinisgor</w:t>
@@ -253,8 +244,8 @@
         <w:rPr>
           <w:rFonts w:ascii="Nunito" w:cs="Nunito" w:eastAsia="Nunito" w:hAnsi="Nunito"/>
           <w:color w:val="0f0f0f"/>
-          <w:sz w:val="17"/>
-          <w:szCs w:val="17"/>
+          <w:sz w:val="20"/>
+          <w:szCs w:val="20"/>
           <w:rtl w:val="0"/>
         </w:rPr>
         <w:t xml:space="preserve"> | </w:t>
@@ -264,54 +255,13 @@
           <w:rPr>
             <w:rFonts w:ascii="Nunito" w:cs="Nunito" w:eastAsia="Nunito" w:hAnsi="Nunito"/>
             <w:color w:val="1155cc"/>
-            <w:sz w:val="17"/>
-            <w:szCs w:val="17"/>
+            <w:sz w:val="20"/>
+            <w:szCs w:val="20"/>
             <w:rtl w:val="0"/>
           </w:rPr>
-          <w:t xml:space="preserve">Portfolio</w:t>
+          <w:t xml:space="preserve">https://ersinisgor.netlify.app</w:t>
         </w:r>
       </w:hyperlink>
-      <w:r>
-        <w:rPr>
-          <w:rFonts w:ascii="Nunito" w:cs="Nunito" w:eastAsia="Nunito" w:hAnsi="Nunito"/>
-          <w:color w:val="0f0f0f"/>
-          <w:sz w:val="17"/>
-          <w:szCs w:val="17"/>
-          <w:rtl w:val="0"/>
-        </w:rPr>
-        <w:t xml:space="preserve"> | </w:t>
-      </w:r>
-      <w:r>
-        <w:rPr>
-          <w:rFonts w:ascii="Nunito" w:cs="Nunito" w:eastAsia="Nunito" w:hAnsi="Nunito"/>
-          <w:color w:val="0f0f0f"/>
-          <w:sz w:val="17"/>
-          <w:szCs w:val="17"/>
-          <w:rtl w:val="0"/>
-        </w:rPr>
-        <w:t xml:space="preserve">Balıkesir, Turkey</w:t>
-      </w:r>
-    </w:p>
-    <w:p>
-      <w:pPr>
-        <w:widowControl w:val="0"/>
-        <w:spacing w:line="167.99999999999997" w:lineRule="auto"/>
-        <w:ind w:left="-270" w:firstLine="0"/>
-        <w:jc w:val="left"/>
-        <w:rPr>
-          <w:rFonts w:ascii="Nunito" w:cs="Nunito" w:eastAsia="Nunito" w:hAnsi="Nunito"/>
-          <w:b w:val="1"/>
-          <w:bCs w:val="1"/>
-          <w:color w:val="76a5af"/>
-          <w:sz w:val="10"/>
-          <w:szCs w:val="10"/>
-        </w:rPr>
-      </w:pPr>
-      <w:r>
-        <w:rPr>
-          <w:rtl w:val="0"/>
-        </w:rPr>
-      </w:r>
     </w:p>
     <w:p>
       <w:pPr>
@@ -325,8 +275,8 @@
         <w:rPr>
           <w:rFonts w:ascii="Montserrat Thin" w:cs="Montserrat Thin" w:eastAsia="Montserrat Thin" w:hAnsi="Montserrat Thin"/>
           <w:color w:val="76a5af"/>
-          <w:sz w:val="20"/>
-          <w:szCs w:val="20"/>
+          <w:sz w:val="18"/>
+          <w:szCs w:val="18"/>
         </w:rPr>
       </w:pPr>
       <w:r>
@@ -335,8 +285,8 @@
           <w:b w:val="1"/>
           <w:bCs w:val="1"/>
           <w:color w:val="76a5af"/>
-          <w:sz w:val="20"/>
-          <w:szCs w:val="20"/>
+          <w:sz w:val="18"/>
+          <w:szCs w:val="18"/>
           <w:rtl w:val="0"/>
         </w:rPr>
         <w:t xml:space="preserve">SUMMARY</w:t>
@@ -397,8 +347,8 @@
         <w:rPr>
           <w:rFonts w:ascii="Montserrat Thin" w:cs="Montserrat Thin" w:eastAsia="Montserrat Thin" w:hAnsi="Montserrat Thin"/>
           <w:color w:val="76a5af"/>
-          <w:sz w:val="20"/>
-          <w:szCs w:val="20"/>
+          <w:sz w:val="18"/>
+          <w:szCs w:val="18"/>
         </w:rPr>
       </w:pPr>
       <w:r>
@@ -407,8 +357,8 @@
           <w:b w:val="1"/>
           <w:bCs w:val="1"/>
           <w:color w:val="76a5af"/>
-          <w:sz w:val="20"/>
-          <w:szCs w:val="20"/>
+          <w:sz w:val="18"/>
+          <w:szCs w:val="18"/>
           <w:rtl w:val="0"/>
         </w:rPr>
         <w:t xml:space="preserve">CORE SKILLS</w:t>
@@ -646,8 +596,8 @@
         <w:rPr>
           <w:rFonts w:ascii="Montserrat Thin" w:cs="Montserrat Thin" w:eastAsia="Montserrat Thin" w:hAnsi="Montserrat Thin"/>
           <w:color w:val="76a5af"/>
-          <w:sz w:val="20"/>
-          <w:szCs w:val="20"/>
+          <w:sz w:val="18"/>
+          <w:szCs w:val="18"/>
         </w:rPr>
       </w:pPr>
       <w:r>
@@ -656,8 +606,8 @@
           <w:b w:val="1"/>
           <w:bCs w:val="1"/>
           <w:color w:val="76a5af"/>
-          <w:sz w:val="20"/>
-          <w:szCs w:val="20"/>
+          <w:sz w:val="18"/>
+          <w:szCs w:val="18"/>
           <w:rtl w:val="0"/>
         </w:rPr>
         <w:t xml:space="preserve">EXPERIENCE</w:t>
@@ -994,8 +944,8 @@
         <w:ind w:left="-270" w:firstLine="0"/>
         <w:rPr>
           <w:rFonts w:ascii="Nunito" w:cs="Nunito" w:eastAsia="Nunito" w:hAnsi="Nunito"/>
-          <w:sz w:val="20"/>
-          <w:szCs w:val="20"/>
+          <w:sz w:val="18"/>
+          <w:szCs w:val="18"/>
         </w:rPr>
       </w:pPr>
       <w:r>
@@ -1004,8 +954,8 @@
           <w:b w:val="1"/>
           <w:bCs w:val="1"/>
           <w:color w:val="76a5af"/>
-          <w:sz w:val="20"/>
-          <w:szCs w:val="20"/>
+          <w:sz w:val="18"/>
+          <w:szCs w:val="18"/>
           <w:rtl w:val="0"/>
         </w:rPr>
         <w:t xml:space="preserve">SELECTED PROJECTS</w:t>
@@ -1724,8 +1674,8 @@
         <w:ind w:left="-270" w:firstLine="0"/>
         <w:rPr>
           <w:rFonts w:ascii="Nunito" w:cs="Nunito" w:eastAsia="Nunito" w:hAnsi="Nunito"/>
-          <w:sz w:val="16"/>
-          <w:szCs w:val="16"/>
+          <w:sz w:val="14"/>
+          <w:szCs w:val="14"/>
         </w:rPr>
       </w:pPr>
       <w:r>
@@ -1734,8 +1684,8 @@
           <w:b w:val="1"/>
           <w:bCs w:val="1"/>
           <w:color w:val="76a5af"/>
-          <w:sz w:val="20"/>
-          <w:szCs w:val="20"/>
+          <w:sz w:val="18"/>
+          <w:szCs w:val="18"/>
           <w:rtl w:val="0"/>
         </w:rPr>
         <w:t xml:space="preserve">EDUCATION</w:t>
@@ -1853,8 +1803,8 @@
           <w:rFonts w:ascii="Nunito" w:cs="Nunito" w:eastAsia="Nunito" w:hAnsi="Nunito"/>
           <w:i w:val="1"/>
           <w:iCs w:val="1"/>
-          <w:sz w:val="16"/>
-          <w:szCs w:val="16"/>
+          <w:sz w:val="14"/>
+          <w:szCs w:val="14"/>
         </w:rPr>
       </w:pPr>
       <w:r>
@@ -1863,8 +1813,8 @@
           <w:b w:val="1"/>
           <w:bCs w:val="1"/>
           <w:color w:val="76a5af"/>
-          <w:sz w:val="20"/>
-          <w:szCs w:val="20"/>
+          <w:sz w:val="18"/>
+          <w:szCs w:val="18"/>
           <w:rtl w:val="0"/>
         </w:rPr>
         <w:t xml:space="preserve">PREVIOUS EXPERIENCE (Civil Engineer - Construction Site Team Lead | 2010 - 2023)</w:t>

</xml_diff>